<commit_message>
🙏 致谢: 加入 AstrBot 和 Iris Chat Memory
</commit_message>
<xml_diff>
--- a/docs/论文/Project_Nexus_中期论文_v5.docx
+++ b/docs/论文/Project_Nexus_中期论文_v5.docx
@@ -13611,13 +13611,7 @@
         </w:rPr>
       </w:pPr>
       <w:r>
-        <w:t>本文的工作基于开源项目AstrBot（https://github.com/Soulter/AstrBot）进行二次开发，感谢AstrBot社区提供的框架支持和插件开发文档。</w:t>
-      </w:r>
-      <w:r>
-        <w:rPr>
-          <w:lang w:eastAsia="zh-CN"/>
-        </w:rPr>
-        <w:t>系统开发过程中参考了NEKO桌面伴侣项目的功能对标清单，在此对相关开发者表示感谢。</w:t>
+        <w:t>本文的工作基于开源项目AstrBot（https://github.com/AstrBotDevs/AstrBot）进行二次开发，AstrBot提供了消息平台接入、LLM Provider抽象、工具调用管线和插件生命周期管理等核心基础设施，Nexus的Hub集中式架构和卫星Bot转发机制深度依赖AstrBot的多平台适配层。感谢AstrBot开发团队的开源贡献和社区支持。记忆系统v0.8.0的FAISS向量检索、遗忘评分算法和置信度分级机制参考了Iris Chat Memory（https://github.com/leafliber/astrbot_plugin_iris_chat_memory）的设计思路，在此对Leafliber的开源贡献表示感谢。</w:t>
       </w:r>
     </w:p>
     <w:sectPr>

</xml_diff>